<commit_message>
Added Teacher Listing in a single statement
</commit_message>
<xml_diff>
--- a/2300005633/functions.docx
+++ b/2300005633/functions.docx
@@ -307,6 +307,19 @@
         <w:rPr>
           <w:lang w:val="en-US"/>
         </w:rPr>
+        <w:t>Will always return positive integer value after a successful call.</w:t>
+      </w:r>
+    </w:p>
+    <w:p>
+      <w:pPr>
+        <w:rPr>
+          <w:lang w:val="en-US"/>
+        </w:rPr>
+      </w:pPr>
+      <w:r>
+        <w:rPr>
+          <w:lang w:val="en-US"/>
+        </w:rPr>
         <w:t xml:space="preserve">If the </w:t>
       </w:r>
       <w:r>
@@ -407,14 +420,12 @@
         </w:rPr>
         <w:t xml:space="preserve"> find the </w:t>
       </w:r>
-      <w:proofErr w:type="gramStart"/>
-      <w:r>
-        <w:rPr>
-          <w:lang w:val="en-US"/>
-        </w:rPr>
-        <w:t>ID</w:t>
-      </w:r>
-      <w:proofErr w:type="gramEnd"/>
+      <w:r>
+        <w:rPr>
+          <w:lang w:val="en-US"/>
+        </w:rPr>
+        <w:t>ID,</w:t>
+      </w:r>
       <w:r>
         <w:rPr>
           <w:lang w:val="en-US"/>
@@ -549,7 +560,13 @@
         <w:rPr>
           <w:lang w:val="en-US"/>
         </w:rPr>
-        <w:t>closes file.</w:t>
+        <w:t>C</w:t>
+      </w:r>
+      <w:r>
+        <w:rPr>
+          <w:lang w:val="en-US"/>
+        </w:rPr>
+        <w:t>loses file.</w:t>
       </w:r>
     </w:p>
     <w:p>
@@ -618,33 +635,69 @@
         <w:rPr>
           <w:lang w:val="en-US"/>
         </w:rPr>
-        <w:t>Asks for failure options.</w:t>
-      </w:r>
-    </w:p>
-    <w:p>
-      <w:pPr>
-        <w:rPr>
-          <w:lang w:val="en-US"/>
-        </w:rPr>
-      </w:pPr>
-      <w:r>
-        <w:rPr>
-          <w:lang w:val="en-US"/>
-        </w:rPr>
-        <w:t>If successful.</w:t>
-      </w:r>
-    </w:p>
-    <w:p>
-      <w:pPr>
-        <w:rPr>
-          <w:lang w:val="en-US"/>
-        </w:rPr>
-      </w:pPr>
-      <w:r>
-        <w:rPr>
-          <w:lang w:val="en-US"/>
-        </w:rPr>
-        <w:t>It asks proper information for the new office hour.</w:t>
+        <w:t xml:space="preserve">Asks for failure </w:t>
+      </w:r>
+      <w:r>
+        <w:rPr>
+          <w:lang w:val="en-US"/>
+        </w:rPr>
+        <w:t xml:space="preserve">fallback </w:t>
+      </w:r>
+      <w:r>
+        <w:rPr>
+          <w:lang w:val="en-US"/>
+        </w:rPr>
+        <w:t>options.</w:t>
+      </w:r>
+    </w:p>
+    <w:p>
+      <w:pPr>
+        <w:rPr>
+          <w:lang w:val="en-US"/>
+        </w:rPr>
+      </w:pPr>
+      <w:r>
+        <w:rPr>
+          <w:lang w:val="en-US"/>
+        </w:rPr>
+        <w:t>If successful</w:t>
+      </w:r>
+      <w:r>
+        <w:rPr>
+          <w:lang w:val="en-US"/>
+        </w:rPr>
+        <w:t xml:space="preserve"> </w:t>
+      </w:r>
+      <w:r>
+        <w:rPr>
+          <w:lang w:val="en-US"/>
+        </w:rPr>
+        <w:t>It asks</w:t>
+      </w:r>
+      <w:r>
+        <w:rPr>
+          <w:lang w:val="en-US"/>
+        </w:rPr>
+        <w:t xml:space="preserve"> for</w:t>
+      </w:r>
+      <w:r>
+        <w:rPr>
+          <w:lang w:val="en-US"/>
+        </w:rPr>
+        <w:t xml:space="preserve"> proper information for the new office hour.</w:t>
+      </w:r>
+    </w:p>
+    <w:p>
+      <w:pPr>
+        <w:rPr>
+          <w:lang w:val="en-US"/>
+        </w:rPr>
+      </w:pPr>
+      <w:r>
+        <w:rPr>
+          <w:lang w:val="en-US"/>
+        </w:rPr>
+        <w:t>Fallback option= Redirect input values to update_office_hour function.</w:t>
       </w:r>
     </w:p>
     <w:p>
@@ -733,29 +786,46 @@
         <w:rPr>
           <w:lang w:val="en-US"/>
         </w:rPr>
-        <w:t>Uses the ID to update information.</w:t>
-      </w:r>
-    </w:p>
-    <w:p>
-      <w:pPr>
-        <w:rPr>
-          <w:lang w:val="en-US"/>
-        </w:rPr>
-      </w:pPr>
-    </w:p>
-    <w:p>
-      <w:pPr>
-        <w:rPr>
-          <w:lang w:val="en-US"/>
-        </w:rPr>
-      </w:pPr>
-    </w:p>
-    <w:p>
-      <w:pPr>
-        <w:rPr>
-          <w:lang w:val="en-US"/>
-        </w:rPr>
-      </w:pPr>
+        <w:t>Gets new information about the updated data.</w:t>
+      </w:r>
+    </w:p>
+    <w:p>
+      <w:pPr>
+        <w:rPr>
+          <w:lang w:val="en-US"/>
+        </w:rPr>
+      </w:pPr>
+      <w:r>
+        <w:rPr>
+          <w:lang w:val="en-US"/>
+        </w:rPr>
+        <w:t>Uses the ID</w:t>
+      </w:r>
+      <w:r>
+        <w:rPr>
+          <w:lang w:val="en-US"/>
+        </w:rPr>
+        <w:t xml:space="preserve"> with the new information</w:t>
+      </w:r>
+      <w:r>
+        <w:rPr>
+          <w:lang w:val="en-US"/>
+        </w:rPr>
+        <w:t xml:space="preserve"> to update information.</w:t>
+      </w:r>
+    </w:p>
+    <w:p>
+      <w:pPr>
+        <w:rPr>
+          <w:lang w:val="en-US"/>
+        </w:rPr>
+      </w:pPr>
+      <w:r>
+        <w:rPr>
+          <w:lang w:val="en-US"/>
+        </w:rPr>
+        <w:t>Calls store_office_hour.</w:t>
+      </w:r>
     </w:p>
     <w:p>
       <w:pPr>
@@ -826,6 +896,19 @@
           <w:lang w:val="en-US"/>
         </w:rPr>
       </w:pPr>
+      <w:r>
+        <w:rPr>
+          <w:lang w:val="en-US"/>
+        </w:rPr>
+        <w:t>Reads values from the data file to memory then reads the memory to print out a table with contents of ID, Day, Start Hour, End Hour.</w:t>
+      </w:r>
+    </w:p>
+    <w:p>
+      <w:pPr>
+        <w:rPr>
+          <w:lang w:val="en-US"/>
+        </w:rPr>
+      </w:pPr>
     </w:p>
     <w:p>
       <w:pPr>
@@ -931,6 +1014,19 @@
           <w:lang w:val="en-US"/>
         </w:rPr>
         <w:t>And if student picks an office hour it stores it inside the appointment.txt file.</w:t>
+      </w:r>
+    </w:p>
+    <w:p>
+      <w:pPr>
+        <w:rPr>
+          <w:lang w:val="en-US"/>
+        </w:rPr>
+      </w:pPr>
+      <w:r>
+        <w:rPr>
+          <w:lang w:val="en-US"/>
+        </w:rPr>
+        <w:t>If student fails to pick warns them.</w:t>
       </w:r>
     </w:p>
     <w:p>

</xml_diff>